<commit_message>
feat(supabase): integrate Supabase Storage, document metadata syncing and document sharing
</commit_message>
<xml_diff>
--- a/docs/PHUONG_AN_TICH_HOP_CLOUD_STUDYHUB.docx
+++ b/docs/PHUONG_AN_TICH_HOP_CLOUD_STUDYHUB.docx
@@ -122,7 +122,16 @@
           <w:color w:val="4A5568"/>
           <w:sz w:val="24"/>
         </w:rPr>
-        <w:t>C THUỶ LỢI</w:t>
+        <w:t>C</w:t>
+      </w:r>
+      <w:r>
+        <w:rPr>
+          <w:rFonts w:ascii="Times New Roman" w:hAnsi="Times New Roman"/>
+          <w:b/>
+          <w:color w:val="4A5568"/>
+          <w:sz w:val="24"/>
+        </w:rPr>
+        <w:t xml:space="preserve"> THUỶ LỢI</w:t>
       </w:r>
     </w:p>
     <w:p>
@@ -25341,6 +25350,10 @@
     <w:p>
       <w:pPr>
         <w:spacing w:after="100"/>
+        <w:rPr>
+          <w:rFonts w:ascii="Times New Roman" w:hAnsi="Times New Roman"/>
+          <w:color w:val="2D3748"/>
+        </w:rPr>
       </w:pPr>
       <w:r>
         <w:rPr>
@@ -26202,6 +26215,544 @@
           <w:color w:val="2D3748"/>
         </w:rPr>
         <w:t>c ngàn sinh viên.</w:t>
+      </w:r>
+    </w:p>
+    <w:p>
+      <w:pPr>
+        <w:spacing w:after="100"/>
+        <w:rPr>
+          <w:rFonts w:ascii="Times New Roman" w:hAnsi="Times New Roman"/>
+          <w:color w:val="2D3748"/>
+        </w:rPr>
+      </w:pPr>
+    </w:p>
+    <w:p>
+      <w:pPr>
+        <w:spacing w:after="100"/>
+        <w:rPr>
+          <w:rFonts w:ascii="Times New Roman" w:hAnsi="Times New Roman"/>
+          <w:color w:val="2D3748"/>
+        </w:rPr>
+      </w:pPr>
+    </w:p>
+    <w:p>
+      <w:pPr>
+        <w:spacing w:after="100"/>
+      </w:pPr>
+      <w:r>
+        <w:lastRenderedPageBreak/>
+        <w:drawing>
+          <wp:inline distT="0" distB="0" distL="0" distR="0" wp14:anchorId="703B2388" wp14:editId="1F104485">
+            <wp:extent cx="6126480" cy="4808220"/>
+            <wp:effectExtent l="0" t="0" r="7620" b="0"/>
+            <wp:docPr id="5" name="Picture 5"/>
+            <wp:cNvGraphicFramePr>
+              <a:graphicFrameLocks xmlns:a="http://schemas.openxmlformats.org/drawingml/2006/main" noChangeAspect="1"/>
+            </wp:cNvGraphicFramePr>
+            <a:graphic xmlns:a="http://schemas.openxmlformats.org/drawingml/2006/main">
+              <a:graphicData uri="http://schemas.openxmlformats.org/drawingml/2006/picture">
+                <pic:pic xmlns:pic="http://schemas.openxmlformats.org/drawingml/2006/picture">
+                  <pic:nvPicPr>
+                    <pic:cNvPr id="1" name=""/>
+                    <pic:cNvPicPr/>
+                  </pic:nvPicPr>
+                  <pic:blipFill>
+                    <a:blip r:embed="rId10"/>
+                    <a:stretch>
+                      <a:fillRect/>
+                    </a:stretch>
+                  </pic:blipFill>
+                  <pic:spPr>
+                    <a:xfrm>
+                      <a:off x="0" y="0"/>
+                      <a:ext cx="6126480" cy="4808220"/>
+                    </a:xfrm>
+                    <a:prstGeom prst="rect">
+                      <a:avLst/>
+                    </a:prstGeom>
+                  </pic:spPr>
+                </pic:pic>
+              </a:graphicData>
+            </a:graphic>
+          </wp:inline>
+        </w:drawing>
+      </w:r>
+    </w:p>
+    <w:p>
+      <w:pPr>
+        <w:spacing w:after="100"/>
+      </w:pPr>
+      <w:r>
+        <w:drawing>
+          <wp:inline distT="0" distB="0" distL="0" distR="0" wp14:anchorId="1A966434" wp14:editId="066FDD52">
+            <wp:extent cx="6126480" cy="3630930"/>
+            <wp:effectExtent l="0" t="0" r="7620" b="7620"/>
+            <wp:docPr id="6" name="Picture 6"/>
+            <wp:cNvGraphicFramePr>
+              <a:graphicFrameLocks xmlns:a="http://schemas.openxmlformats.org/drawingml/2006/main" noChangeAspect="1"/>
+            </wp:cNvGraphicFramePr>
+            <a:graphic xmlns:a="http://schemas.openxmlformats.org/drawingml/2006/main">
+              <a:graphicData uri="http://schemas.openxmlformats.org/drawingml/2006/picture">
+                <pic:pic xmlns:pic="http://schemas.openxmlformats.org/drawingml/2006/picture">
+                  <pic:nvPicPr>
+                    <pic:cNvPr id="1" name=""/>
+                    <pic:cNvPicPr/>
+                  </pic:nvPicPr>
+                  <pic:blipFill>
+                    <a:blip r:embed="rId11"/>
+                    <a:stretch>
+                      <a:fillRect/>
+                    </a:stretch>
+                  </pic:blipFill>
+                  <pic:spPr>
+                    <a:xfrm>
+                      <a:off x="0" y="0"/>
+                      <a:ext cx="6126480" cy="3630930"/>
+                    </a:xfrm>
+                    <a:prstGeom prst="rect">
+                      <a:avLst/>
+                    </a:prstGeom>
+                  </pic:spPr>
+                </pic:pic>
+              </a:graphicData>
+            </a:graphic>
+          </wp:inline>
+        </w:drawing>
+      </w:r>
+    </w:p>
+    <w:p>
+      <w:pPr>
+        <w:spacing w:after="100"/>
+      </w:pPr>
+      <w:r>
+        <w:lastRenderedPageBreak/>
+        <w:drawing>
+          <wp:inline distT="0" distB="0" distL="0" distR="0" wp14:anchorId="4192E10B" wp14:editId="13B07819">
+            <wp:extent cx="6126480" cy="3605530"/>
+            <wp:effectExtent l="0" t="0" r="7620" b="0"/>
+            <wp:docPr id="7" name="Picture 7"/>
+            <wp:cNvGraphicFramePr>
+              <a:graphicFrameLocks xmlns:a="http://schemas.openxmlformats.org/drawingml/2006/main" noChangeAspect="1"/>
+            </wp:cNvGraphicFramePr>
+            <a:graphic xmlns:a="http://schemas.openxmlformats.org/drawingml/2006/main">
+              <a:graphicData uri="http://schemas.openxmlformats.org/drawingml/2006/picture">
+                <pic:pic xmlns:pic="http://schemas.openxmlformats.org/drawingml/2006/picture">
+                  <pic:nvPicPr>
+                    <pic:cNvPr id="1" name=""/>
+                    <pic:cNvPicPr/>
+                  </pic:nvPicPr>
+                  <pic:blipFill>
+                    <a:blip r:embed="rId12"/>
+                    <a:stretch>
+                      <a:fillRect/>
+                    </a:stretch>
+                  </pic:blipFill>
+                  <pic:spPr>
+                    <a:xfrm>
+                      <a:off x="0" y="0"/>
+                      <a:ext cx="6126480" cy="3605530"/>
+                    </a:xfrm>
+                    <a:prstGeom prst="rect">
+                      <a:avLst/>
+                    </a:prstGeom>
+                  </pic:spPr>
+                </pic:pic>
+              </a:graphicData>
+            </a:graphic>
+          </wp:inline>
+        </w:drawing>
+      </w:r>
+    </w:p>
+    <w:p>
+      <w:pPr>
+        <w:spacing w:after="100"/>
+      </w:pPr>
+      <w:r>
+        <w:drawing>
+          <wp:inline distT="0" distB="0" distL="0" distR="0" wp14:anchorId="23C5750D" wp14:editId="5C7CC5CA">
+            <wp:extent cx="6126480" cy="3829050"/>
+            <wp:effectExtent l="0" t="0" r="7620" b="0"/>
+            <wp:docPr id="8" name="Picture 8"/>
+            <wp:cNvGraphicFramePr>
+              <a:graphicFrameLocks xmlns:a="http://schemas.openxmlformats.org/drawingml/2006/main" noChangeAspect="1"/>
+            </wp:cNvGraphicFramePr>
+            <a:graphic xmlns:a="http://schemas.openxmlformats.org/drawingml/2006/main">
+              <a:graphicData uri="http://schemas.openxmlformats.org/drawingml/2006/picture">
+                <pic:pic xmlns:pic="http://schemas.openxmlformats.org/drawingml/2006/picture">
+                  <pic:nvPicPr>
+                    <pic:cNvPr id="1" name=""/>
+                    <pic:cNvPicPr/>
+                  </pic:nvPicPr>
+                  <pic:blipFill>
+                    <a:blip r:embed="rId13"/>
+                    <a:stretch>
+                      <a:fillRect/>
+                    </a:stretch>
+                  </pic:blipFill>
+                  <pic:spPr>
+                    <a:xfrm>
+                      <a:off x="0" y="0"/>
+                      <a:ext cx="6126480" cy="3829050"/>
+                    </a:xfrm>
+                    <a:prstGeom prst="rect">
+                      <a:avLst/>
+                    </a:prstGeom>
+                  </pic:spPr>
+                </pic:pic>
+              </a:graphicData>
+            </a:graphic>
+          </wp:inline>
+        </w:drawing>
+      </w:r>
+    </w:p>
+    <w:p>
+      <w:pPr>
+        <w:spacing w:after="100"/>
+      </w:pPr>
+      <w:r>
+        <w:lastRenderedPageBreak/>
+        <w:drawing>
+          <wp:inline distT="0" distB="0" distL="0" distR="0" wp14:anchorId="4E1523A0" wp14:editId="79E07918">
+            <wp:extent cx="6126480" cy="3829050"/>
+            <wp:effectExtent l="0" t="0" r="7620" b="0"/>
+            <wp:docPr id="9" name="Picture 9"/>
+            <wp:cNvGraphicFramePr>
+              <a:graphicFrameLocks xmlns:a="http://schemas.openxmlformats.org/drawingml/2006/main" noChangeAspect="1"/>
+            </wp:cNvGraphicFramePr>
+            <a:graphic xmlns:a="http://schemas.openxmlformats.org/drawingml/2006/main">
+              <a:graphicData uri="http://schemas.openxmlformats.org/drawingml/2006/picture">
+                <pic:pic xmlns:pic="http://schemas.openxmlformats.org/drawingml/2006/picture">
+                  <pic:nvPicPr>
+                    <pic:cNvPr id="1" name=""/>
+                    <pic:cNvPicPr/>
+                  </pic:nvPicPr>
+                  <pic:blipFill>
+                    <a:blip r:embed="rId14"/>
+                    <a:stretch>
+                      <a:fillRect/>
+                    </a:stretch>
+                  </pic:blipFill>
+                  <pic:spPr>
+                    <a:xfrm>
+                      <a:off x="0" y="0"/>
+                      <a:ext cx="6126480" cy="3829050"/>
+                    </a:xfrm>
+                    <a:prstGeom prst="rect">
+                      <a:avLst/>
+                    </a:prstGeom>
+                  </pic:spPr>
+                </pic:pic>
+              </a:graphicData>
+            </a:graphic>
+          </wp:inline>
+        </w:drawing>
+      </w:r>
+    </w:p>
+    <w:p>
+      <w:pPr>
+        <w:spacing w:after="100"/>
+      </w:pPr>
+      <w:r>
+        <w:drawing>
+          <wp:inline distT="0" distB="0" distL="0" distR="0" wp14:anchorId="754615D0" wp14:editId="738B627A">
+            <wp:extent cx="6126480" cy="3787140"/>
+            <wp:effectExtent l="0" t="0" r="7620" b="3810"/>
+            <wp:docPr id="10" name="Picture 10"/>
+            <wp:cNvGraphicFramePr>
+              <a:graphicFrameLocks xmlns:a="http://schemas.openxmlformats.org/drawingml/2006/main" noChangeAspect="1"/>
+            </wp:cNvGraphicFramePr>
+            <a:graphic xmlns:a="http://schemas.openxmlformats.org/drawingml/2006/main">
+              <a:graphicData uri="http://schemas.openxmlformats.org/drawingml/2006/picture">
+                <pic:pic xmlns:pic="http://schemas.openxmlformats.org/drawingml/2006/picture">
+                  <pic:nvPicPr>
+                    <pic:cNvPr id="1" name=""/>
+                    <pic:cNvPicPr/>
+                  </pic:nvPicPr>
+                  <pic:blipFill>
+                    <a:blip r:embed="rId15"/>
+                    <a:stretch>
+                      <a:fillRect/>
+                    </a:stretch>
+                  </pic:blipFill>
+                  <pic:spPr>
+                    <a:xfrm>
+                      <a:off x="0" y="0"/>
+                      <a:ext cx="6126480" cy="3787140"/>
+                    </a:xfrm>
+                    <a:prstGeom prst="rect">
+                      <a:avLst/>
+                    </a:prstGeom>
+                  </pic:spPr>
+                </pic:pic>
+              </a:graphicData>
+            </a:graphic>
+          </wp:inline>
+        </w:drawing>
+      </w:r>
+    </w:p>
+    <w:p>
+      <w:pPr>
+        <w:spacing w:after="100"/>
+      </w:pPr>
+    </w:p>
+    <w:p>
+      <w:pPr>
+        <w:spacing w:after="100"/>
+      </w:pPr>
+      <w:r>
+        <w:lastRenderedPageBreak/>
+        <w:drawing>
+          <wp:inline distT="0" distB="0" distL="0" distR="0" wp14:anchorId="4B118079" wp14:editId="6E240512">
+            <wp:extent cx="6126480" cy="3632200"/>
+            <wp:effectExtent l="0" t="0" r="7620" b="6350"/>
+            <wp:docPr id="11" name="Picture 11"/>
+            <wp:cNvGraphicFramePr>
+              <a:graphicFrameLocks xmlns:a="http://schemas.openxmlformats.org/drawingml/2006/main" noChangeAspect="1"/>
+            </wp:cNvGraphicFramePr>
+            <a:graphic xmlns:a="http://schemas.openxmlformats.org/drawingml/2006/main">
+              <a:graphicData uri="http://schemas.openxmlformats.org/drawingml/2006/picture">
+                <pic:pic xmlns:pic="http://schemas.openxmlformats.org/drawingml/2006/picture">
+                  <pic:nvPicPr>
+                    <pic:cNvPr id="1" name=""/>
+                    <pic:cNvPicPr/>
+                  </pic:nvPicPr>
+                  <pic:blipFill>
+                    <a:blip r:embed="rId16"/>
+                    <a:stretch>
+                      <a:fillRect/>
+                    </a:stretch>
+                  </pic:blipFill>
+                  <pic:spPr>
+                    <a:xfrm>
+                      <a:off x="0" y="0"/>
+                      <a:ext cx="6126480" cy="3632200"/>
+                    </a:xfrm>
+                    <a:prstGeom prst="rect">
+                      <a:avLst/>
+                    </a:prstGeom>
+                  </pic:spPr>
+                </pic:pic>
+              </a:graphicData>
+            </a:graphic>
+          </wp:inline>
+        </w:drawing>
+      </w:r>
+    </w:p>
+    <w:p>
+      <w:pPr>
+        <w:spacing w:after="100"/>
+      </w:pPr>
+      <w:r>
+        <w:drawing>
+          <wp:inline distT="0" distB="0" distL="0" distR="0" wp14:anchorId="706B3D60" wp14:editId="6915CAF3">
+            <wp:extent cx="6126480" cy="3794125"/>
+            <wp:effectExtent l="0" t="0" r="7620" b="0"/>
+            <wp:docPr id="12" name="Picture 12"/>
+            <wp:cNvGraphicFramePr>
+              <a:graphicFrameLocks xmlns:a="http://schemas.openxmlformats.org/drawingml/2006/main" noChangeAspect="1"/>
+            </wp:cNvGraphicFramePr>
+            <a:graphic xmlns:a="http://schemas.openxmlformats.org/drawingml/2006/main">
+              <a:graphicData uri="http://schemas.openxmlformats.org/drawingml/2006/picture">
+                <pic:pic xmlns:pic="http://schemas.openxmlformats.org/drawingml/2006/picture">
+                  <pic:nvPicPr>
+                    <pic:cNvPr id="1" name=""/>
+                    <pic:cNvPicPr/>
+                  </pic:nvPicPr>
+                  <pic:blipFill>
+                    <a:blip r:embed="rId17"/>
+                    <a:stretch>
+                      <a:fillRect/>
+                    </a:stretch>
+                  </pic:blipFill>
+                  <pic:spPr>
+                    <a:xfrm>
+                      <a:off x="0" y="0"/>
+                      <a:ext cx="6126480" cy="3794125"/>
+                    </a:xfrm>
+                    <a:prstGeom prst="rect">
+                      <a:avLst/>
+                    </a:prstGeom>
+                  </pic:spPr>
+                </pic:pic>
+              </a:graphicData>
+            </a:graphic>
+          </wp:inline>
+        </w:drawing>
+      </w:r>
+    </w:p>
+    <w:p>
+      <w:pPr>
+        <w:spacing w:after="100"/>
+      </w:pPr>
+      <w:r>
+        <w:lastRenderedPageBreak/>
+        <w:drawing>
+          <wp:inline distT="0" distB="0" distL="0" distR="0" wp14:anchorId="5C4A6243" wp14:editId="6ED7D993">
+            <wp:extent cx="6126480" cy="3296285"/>
+            <wp:effectExtent l="0" t="0" r="7620" b="0"/>
+            <wp:docPr id="13" name="Picture 13"/>
+            <wp:cNvGraphicFramePr>
+              <a:graphicFrameLocks xmlns:a="http://schemas.openxmlformats.org/drawingml/2006/main" noChangeAspect="1"/>
+            </wp:cNvGraphicFramePr>
+            <a:graphic xmlns:a="http://schemas.openxmlformats.org/drawingml/2006/main">
+              <a:graphicData uri="http://schemas.openxmlformats.org/drawingml/2006/picture">
+                <pic:pic xmlns:pic="http://schemas.openxmlformats.org/drawingml/2006/picture">
+                  <pic:nvPicPr>
+                    <pic:cNvPr id="1" name=""/>
+                    <pic:cNvPicPr/>
+                  </pic:nvPicPr>
+                  <pic:blipFill>
+                    <a:blip r:embed="rId18"/>
+                    <a:stretch>
+                      <a:fillRect/>
+                    </a:stretch>
+                  </pic:blipFill>
+                  <pic:spPr>
+                    <a:xfrm>
+                      <a:off x="0" y="0"/>
+                      <a:ext cx="6126480" cy="3296285"/>
+                    </a:xfrm>
+                    <a:prstGeom prst="rect">
+                      <a:avLst/>
+                    </a:prstGeom>
+                  </pic:spPr>
+                </pic:pic>
+              </a:graphicData>
+            </a:graphic>
+          </wp:inline>
+        </w:drawing>
+      </w:r>
+    </w:p>
+    <w:p>
+      <w:pPr>
+        <w:spacing w:after="100"/>
+      </w:pPr>
+    </w:p>
+    <w:p>
+      <w:pPr>
+        <w:spacing w:after="100"/>
+      </w:pPr>
+      <w:r>
+        <w:drawing>
+          <wp:inline distT="0" distB="0" distL="0" distR="0" wp14:anchorId="20472308" wp14:editId="743BCCC8">
+            <wp:extent cx="6126480" cy="3829050"/>
+            <wp:effectExtent l="0" t="0" r="7620" b="0"/>
+            <wp:docPr id="14" name="Picture 14"/>
+            <wp:cNvGraphicFramePr>
+              <a:graphicFrameLocks xmlns:a="http://schemas.openxmlformats.org/drawingml/2006/main" noChangeAspect="1"/>
+            </wp:cNvGraphicFramePr>
+            <a:graphic xmlns:a="http://schemas.openxmlformats.org/drawingml/2006/main">
+              <a:graphicData uri="http://schemas.openxmlformats.org/drawingml/2006/picture">
+                <pic:pic xmlns:pic="http://schemas.openxmlformats.org/drawingml/2006/picture">
+                  <pic:nvPicPr>
+                    <pic:cNvPr id="1" name=""/>
+                    <pic:cNvPicPr/>
+                  </pic:nvPicPr>
+                  <pic:blipFill>
+                    <a:blip r:embed="rId19"/>
+                    <a:stretch>
+                      <a:fillRect/>
+                    </a:stretch>
+                  </pic:blipFill>
+                  <pic:spPr>
+                    <a:xfrm>
+                      <a:off x="0" y="0"/>
+                      <a:ext cx="6126480" cy="3829050"/>
+                    </a:xfrm>
+                    <a:prstGeom prst="rect">
+                      <a:avLst/>
+                    </a:prstGeom>
+                  </pic:spPr>
+                </pic:pic>
+              </a:graphicData>
+            </a:graphic>
+          </wp:inline>
+        </w:drawing>
+      </w:r>
+    </w:p>
+    <w:p>
+      <w:pPr>
+        <w:spacing w:after="100"/>
+      </w:pPr>
+      <w:r>
+        <w:lastRenderedPageBreak/>
+        <w:drawing>
+          <wp:inline distT="0" distB="0" distL="0" distR="0" wp14:anchorId="7CA22BD2" wp14:editId="56C40358">
+            <wp:extent cx="6126480" cy="3829050"/>
+            <wp:effectExtent l="0" t="0" r="7620" b="0"/>
+            <wp:docPr id="15" name="Picture 15"/>
+            <wp:cNvGraphicFramePr>
+              <a:graphicFrameLocks xmlns:a="http://schemas.openxmlformats.org/drawingml/2006/main" noChangeAspect="1"/>
+            </wp:cNvGraphicFramePr>
+            <a:graphic xmlns:a="http://schemas.openxmlformats.org/drawingml/2006/main">
+              <a:graphicData uri="http://schemas.openxmlformats.org/drawingml/2006/picture">
+                <pic:pic xmlns:pic="http://schemas.openxmlformats.org/drawingml/2006/picture">
+                  <pic:nvPicPr>
+                    <pic:cNvPr id="1" name=""/>
+                    <pic:cNvPicPr/>
+                  </pic:nvPicPr>
+                  <pic:blipFill>
+                    <a:blip r:embed="rId20"/>
+                    <a:stretch>
+                      <a:fillRect/>
+                    </a:stretch>
+                  </pic:blipFill>
+                  <pic:spPr>
+                    <a:xfrm>
+                      <a:off x="0" y="0"/>
+                      <a:ext cx="6126480" cy="3829050"/>
+                    </a:xfrm>
+                    <a:prstGeom prst="rect">
+                      <a:avLst/>
+                    </a:prstGeom>
+                  </pic:spPr>
+                </pic:pic>
+              </a:graphicData>
+            </a:graphic>
+          </wp:inline>
+        </w:drawing>
+      </w:r>
+    </w:p>
+    <w:p>
+      <w:pPr>
+        <w:spacing w:after="100"/>
+      </w:pPr>
+      <w:r>
+        <w:drawing>
+          <wp:inline distT="0" distB="0" distL="0" distR="0" wp14:anchorId="2071F810" wp14:editId="62CA02E0">
+            <wp:extent cx="6126480" cy="3829050"/>
+            <wp:effectExtent l="0" t="0" r="7620" b="0"/>
+            <wp:docPr id="16" name="Picture 16"/>
+            <wp:cNvGraphicFramePr>
+              <a:graphicFrameLocks xmlns:a="http://schemas.openxmlformats.org/drawingml/2006/main" noChangeAspect="1"/>
+            </wp:cNvGraphicFramePr>
+            <a:graphic xmlns:a="http://schemas.openxmlformats.org/drawingml/2006/main">
+              <a:graphicData uri="http://schemas.openxmlformats.org/drawingml/2006/picture">
+                <pic:pic xmlns:pic="http://schemas.openxmlformats.org/drawingml/2006/picture">
+                  <pic:nvPicPr>
+                    <pic:cNvPr id="1" name=""/>
+                    <pic:cNvPicPr/>
+                  </pic:nvPicPr>
+                  <pic:blipFill>
+                    <a:blip r:embed="rId21"/>
+                    <a:stretch>
+                      <a:fillRect/>
+                    </a:stretch>
+                  </pic:blipFill>
+                  <pic:spPr>
+                    <a:xfrm>
+                      <a:off x="0" y="0"/>
+                      <a:ext cx="6126480" cy="3829050"/>
+                    </a:xfrm>
+                    <a:prstGeom prst="rect">
+                      <a:avLst/>
+                    </a:prstGeom>
+                  </pic:spPr>
+                </pic:pic>
+              </a:graphicData>
+            </a:graphic>
+          </wp:inline>
+        </w:drawing>
       </w:r>
     </w:p>
     <w:sectPr>

</xml_diff>